<commit_message>
Paper C PLOS: justify body text in manuscript, S1 Appendix and cover letter
Co-Authored-By: Claude Opus 5.5 <noreply@anthropic.com>
Claude-Session: https://claude.ai/code/session_011zPDaCYE4jmmpoRvPu4SUX
</commit_message>
<xml_diff>
--- a/paper2/final/PLOS_ONE/Cover_letter.docx
+++ b/paper2/final/PLOS_ONE/Cover_letter.docx
@@ -5,6 +5,7 @@
     <w:p>
       <w:pPr>
         <w:pStyle w:val="FirstParagraph"/>
+        <w:jc w:val="both"/>
       </w:pPr>
       <w:r>
         <w:t xml:space="preserve">6 October 2026</w:t>
@@ -13,6 +14,7 @@
     <w:p>
       <w:pPr>
         <w:pStyle w:val="BodyText"/>
+        <w:jc w:val="both"/>
       </w:pPr>
       <w:r>
         <w:t xml:space="preserve">The Editors,</w:t>
@@ -31,6 +33,7 @@
     <w:p>
       <w:pPr>
         <w:pStyle w:val="BodyText"/>
+        <w:jc w:val="both"/>
       </w:pPr>
       <w:r>
         <w:rPr>
@@ -71,6 +74,7 @@
     <w:p>
       <w:pPr>
         <w:pStyle w:val="BodyText"/>
+        <w:jc w:val="both"/>
       </w:pPr>
       <w:r>
         <w:t xml:space="preserve">Dear Editors,</w:t>
@@ -79,6 +83,7 @@
     <w:p>
       <w:pPr>
         <w:pStyle w:val="BodyText"/>
+        <w:jc w:val="both"/>
       </w:pPr>
       <w:r>
         <w:t xml:space="preserve">We submit the above manuscript for consideration as a Research Article in</w:t>
@@ -100,6 +105,7 @@
     <w:p>
       <w:pPr>
         <w:pStyle w:val="BodyText"/>
+        <w:jc w:val="both"/>
       </w:pPr>
       <w:r>
         <w:rPr>
@@ -118,6 +124,7 @@
     <w:p>
       <w:pPr>
         <w:pStyle w:val="BodyText"/>
+        <w:jc w:val="both"/>
       </w:pPr>
       <w:r>
         <w:rPr>
@@ -149,6 +156,7 @@
     <w:p>
       <w:pPr>
         <w:pStyle w:val="BodyText"/>
+        <w:jc w:val="both"/>
       </w:pPr>
       <w:r>
         <w:rPr>
@@ -167,6 +175,7 @@
     <w:p>
       <w:pPr>
         <w:pStyle w:val="BodyText"/>
+        <w:jc w:val="both"/>
       </w:pPr>
       <w:r>
         <w:rPr>
@@ -201,6 +210,7 @@
     <w:p>
       <w:pPr>
         <w:pStyle w:val="BodyText"/>
+        <w:jc w:val="both"/>
       </w:pPr>
       <w:r>
         <w:rPr>
@@ -219,6 +229,7 @@
     <w:p>
       <w:pPr>
         <w:pStyle w:val="BodyText"/>
+        <w:jc w:val="both"/>
       </w:pPr>
       <w:r>
         <w:t xml:space="preserve">Sincerely,</w:t>
@@ -227,6 +238,7 @@
     <w:p>
       <w:pPr>
         <w:pStyle w:val="BodyText"/>
+        <w:jc w:val="both"/>
       </w:pPr>
       <w:r>
         <w:t xml:space="preserve">Nguyen Van Trung (corresponding author), on behalf of all authors</w:t>

</xml_diff>